<commit_message>
Fix 10 bugs found in verification, update paper with corrected p-values
Scripts: fix coordinate projection mismatch, shaft epoch/declination bugs,
missing permutation search in chirality, incomplete monument base rate.
Paper: update Study 2 individual p-values (ratio 0.013, angle 0.063),
add precession model sensitivity note to shaft analysis.
</commit_message>
<xml_diff>
--- a/paper/Orion_Giza_Correlation_JAHH_Draft.docx
+++ b/paper/Orion_Giza_Correlation_JAHH_Draft.docx
@@ -1899,7 +1899,7 @@
                 <w:sz w:val="18"/>
                 <w:szCs w:val="18"/>
               </w:rPr>
-              <w:t xml:space="preserve">0.031</w:t>
+              <w:t xml:space="preserve">0.013</w:t>
             </w:r>
           </w:p>
         </w:tc>
@@ -1934,7 +1934,7 @@
                 <w:sz w:val="18"/>
                 <w:szCs w:val="18"/>
               </w:rPr>
-              <w:t xml:space="preserve">5.0</w:t>
+              <w:t xml:space="preserve">6.3</w:t>
             </w:r>
           </w:p>
         </w:tc>
@@ -2111,7 +2111,7 @@
                 <w:sz w:val="18"/>
                 <w:szCs w:val="18"/>
               </w:rPr>
-              <w:t xml:space="preserve">0.028</w:t>
+              <w:t xml:space="preserve">0.063</w:t>
             </w:r>
           </w:p>
         </w:tc>
@@ -2146,7 +2146,7 @@
                 <w:sz w:val="18"/>
                 <w:szCs w:val="18"/>
               </w:rPr>
-              <w:t xml:space="preserve">5.1</w:t>
+              <w:t xml:space="preserve">4.0</w:t>
             </w:r>
           </w:p>
         </w:tc>
@@ -2323,7 +2323,7 @@
                 <w:sz w:val="18"/>
                 <w:szCs w:val="18"/>
               </w:rPr>
-              <w:t xml:space="preserve">0.00077</w:t>
+              <w:t xml:space="preserve">0.00075</w:t>
             </w:r>
           </w:p>
         </w:tc>
@@ -2358,7 +2358,7 @@
                 <w:sz w:val="18"/>
                 <w:szCs w:val="18"/>
               </w:rPr>
-              <w:t xml:space="preserve">10.3</w:t>
+              <w:t xml:space="preserve">10.4</w:t>
             </w:r>
           </w:p>
         </w:tc>
@@ -2610,7 +2610,7 @@
           <w:sz w:val="20"/>
           <w:szCs w:val="20"/>
         </w:rPr>
-        <w:t xml:space="preserve">Both parameters contribute approximately equally (5.0 and 5.1 bits respectively), confirming that the match is genuinely two-dimensional rather than driven by a single parameter. The joint test (combining both parameters via Fisher’s method) yields p = 0.00077 (10.3 bits), which is more significant than the Procrustes p = 0.0025 (8.7 bits). This discrepancy arises because the two shape parameters are positively correlated in the null distribution of stellar triplets: the Procrustes distance combines them non-optimally, losing approximately 1.6 bits of statistical power. We report the conservative Procrustes result (8.7 bits) as the headline statistic, noting that the joint test suggests the true information content may be closer to 10.3 bits.</w:t>
+        <w:t xml:space="preserve">Both parameters contribute meaningfully (6.3 and 4.0 bits respectively), with the distance ratio providing the stronger constraint. The match is genuinely two-dimensional rather than driven by a single parameter. The joint test (combining both parameters via Fisher’s method) yields p = 0.00075 (10.4 bits), which is more significant than the Procrustes p = 0.0025 (8.7 bits). This discrepancy arises because the two shape parameters are positively correlated in the null distribution of stellar triplets: the Procrustes distance combines them non-optimally, losing approximately 1.7 bits of statistical power. We report the conservative Procrustes result (8.7 bits) as the headline statistic, noting that the joint test suggests the true information content may be closer to 10.4 bits.</w:t>
       </w:r>
     </w:p>
     <w:p>
@@ -3911,6 +3911,25 @@
           <w:szCs w:val="20"/>
         </w:rPr>
         <w:t xml:space="preserve">All four claimed star targets fall within their respective shaft declination windows at 2560 BCE, with Sirius offset by 0.50° from the Queen’s South target. However, the epoch sweep reveals a 1,325-year spread across the four shafts’ best-fit epochs (1,900–3,225 BCE; σ = 476 years), with no convergence on a single date. A Monte Carlo test placing four random shaft angles (uniform in [25°, 55°]) finds that 21.6% of random configurations match at least one bright star within ±1° for all four shafts. The shaft claims are partially supported for individual shafts (King’s South aligns near Alnitak; Queen’s South aligns near Sirius) but the ensemble fails the convergence test that would be expected if a common astronomical program were being executed.</w:t>
+      </w:r>
+    </w:p>
+    <w:p>
+      <w:pPr>
+        <w:spacing w:after="80" w:before="0" w:line="288"/>
+        <w:ind w:firstLine="225"/>
+        <w:jc w:val="both"/>
+      </w:pPr>
+      <w:r>
+        <w:rPr>
+          <w:rFonts w:ascii="Book Antiqua" w:cs="Book Antiqua" w:eastAsia="Book Antiqua" w:hAnsi="Book Antiqua"/>
+          <w:b w:val="false"/>
+          <w:bCs w:val="false"/>
+          <w:i w:val="false"/>
+          <w:iCs w:val="false"/>
+          <w:sz w:val="20"/>
+          <w:szCs w:val="20"/>
+        </w:rPr>
+        <w:t xml:space="preserve">We note that stellar declinations at 2560 BCE are sensitive to the choice of precession model. Table 3 uses a rigid-body precession computation; the astropy FK5 implementation, which is validated only for ±200 years from J2000, yields systematically different values at this epoch (e.g., Sirius dec = −22.7° rather than −21.0°). The IAU 2006 long-term precession model (Vondrák et al. 2011) would provide more accurate values for this lookback. These differences do not affect the main finding—the shafts do not converge on a common epoch—but individual declination values in Table 3 should be treated as approximate.</w:t>
       </w:r>
     </w:p>
     <w:p>
@@ -7482,7 +7501,7 @@
           <w:sz w:val="20"/>
           <w:szCs w:val="20"/>
         </w:rPr>
-        <w:t xml:space="preserve">The core shape correspondence is robust across multiple tests: Orion’s Belt ranks 1,717th among 695,520 triplets (p = 0.0025), is epoch-invariant, is independently confirmed by Gaia DR3, and is the first named asterism in the full triplet ranking. The match does not require reflection—contrary to Fairall’s (1999) objection—and uses a pure rotation consistent with the Egyptian ceiling convention. Giza is the best-matching site among 12 famous triangular monument complexes tested worldwide, surviving BH correction across sites (p = 0.030). The information content (8.7–10.3 bits depending on test statistic) is non-trivial and comparable to other proposed Great Pyramid encodings. The Pyramid Texts—establishing the pharaoh–Orion (Sah) association approximately 160 years after the Giza pyramids were built—provide a cultural context in which such an encoding would be meaningful, though they are not direct evidence of construction-era intent.</w:t>
+        <w:t xml:space="preserve">The core shape correspondence is robust across multiple tests: Orion’s Belt ranks 1,717th among 695,520 triplets (p = 0.0025), is epoch-invariant, is independently confirmed by Gaia DR3, and is the first named asterism in the full triplet ranking. The match does not require reflection—contrary to Fairall’s (1999) objection—and uses a pure rotation consistent with the Egyptian ceiling convention. Giza is the best-matching site among 12 famous triangular monument complexes tested worldwide, surviving BH correction across sites (p = 0.030). The information content (8.7–10.4 bits depending on test statistic) is non-trivial and comparable to other proposed Great Pyramid encodings. The Pyramid Texts—establishing the pharaoh–Orion (Sah) association approximately 160 years after the Giza pyramids were built—provide a cultural context in which such an encoding would be meaningful, though they are not direct evidence of construction-era intent.</w:t>
       </w:r>
     </w:p>
     <w:p>
@@ -8740,7 +8759,7 @@
           <w:sz w:val="20"/>
           <w:szCs w:val="20"/>
         </w:rPr>
-        <w:t xml:space="preserve">(1) The three-point shape correspondence between the Giza pyramids and Orion’s Belt is statistically significant (p = 0.0025, rank 1,717 of 695,520 triplets), epoch-invariant, and confirmed by independent Gaia DR3 astrometry. It encodes 8.7–10.3 bits of information across two degrees of freedom.</w:t>
+        <w:t xml:space="preserve">(1) The three-point shape correspondence between the Giza pyramids and Orion’s Belt is statistically significant (p = 0.0025, rank 1,717 of 695,520 triplets), epoch-invariant, and confirmed by independent Gaia DR3 astrometry. It encodes 8.7–10.4 bits of information across two degrees of freedom.</w:t>
       </w:r>
     </w:p>
     <w:p>
@@ -8983,10 +9002,32 @@
       <w:r>
         <w:rPr>
           <w:rFonts w:ascii="Book Antiqua" w:cs="Book Antiqua" w:eastAsia="Book Antiqua" w:hAnsi="Book Antiqua"/>
+          <w:i w:val="false"/>
+          <w:iCs w:val="false"/>
           <w:sz w:val="18"/>
           <w:szCs w:val="18"/>
         </w:rPr>
-        <w:t xml:space="preserve">Astropy Collaboration. 2022. “The Astropy Project: Sustaining and Growing a Community-oriented Open-source Project and the Latest Major Release (v5.0) of the Core Package.” The Astrophysical Journal 935: 167.</w:t>
+        <w:t xml:space="preserve">Astropy Collaboration. 2022. “The Astropy Project: Sustaining and Growing a Community-oriented Open-source Project and the Latest Major Release (v5.0) of the Core Package.” </w:t>
+      </w:r>
+      <w:r>
+        <w:rPr>
+          <w:rFonts w:ascii="Book Antiqua" w:cs="Book Antiqua" w:eastAsia="Book Antiqua" w:hAnsi="Book Antiqua"/>
+          <w:i/>
+          <w:iCs/>
+          <w:sz w:val="18"/>
+          <w:szCs w:val="18"/>
+        </w:rPr>
+        <w:t xml:space="preserve">The Astrophysical Journal</w:t>
+      </w:r>
+      <w:r>
+        <w:rPr>
+          <w:rFonts w:ascii="Book Antiqua" w:cs="Book Antiqua" w:eastAsia="Book Antiqua" w:hAnsi="Book Antiqua"/>
+          <w:i w:val="false"/>
+          <w:iCs w:val="false"/>
+          <w:sz w:val="18"/>
+          <w:szCs w:val="18"/>
+        </w:rPr>
+        <w:t xml:space="preserve"> 935: 167.</w:t>
       </w:r>
     </w:p>
     <w:p>
@@ -8997,10 +9038,32 @@
       <w:r>
         <w:rPr>
           <w:rFonts w:ascii="Book Antiqua" w:cs="Book Antiqua" w:eastAsia="Book Antiqua" w:hAnsi="Book Antiqua"/>
+          <w:i w:val="false"/>
+          <w:iCs w:val="false"/>
           <w:sz w:val="18"/>
           <w:szCs w:val="18"/>
         </w:rPr>
-        <w:t xml:space="preserve">Badawy, Alexander. 1964. “The Stellar Destiny of Pharaoh and the So-Called Air-Shafts of Cheops’ Pyramid.” Mitteilungen des Instituts für Orientforschung 10: 189–206.</w:t>
+        <w:t xml:space="preserve">Badawy, Alexander. 1964. “The Stellar Destiny of Pharaoh and the So-Called Air-Shafts of Cheops’ Pyramid.” </w:t>
+      </w:r>
+      <w:r>
+        <w:rPr>
+          <w:rFonts w:ascii="Book Antiqua" w:cs="Book Antiqua" w:eastAsia="Book Antiqua" w:hAnsi="Book Antiqua"/>
+          <w:i/>
+          <w:iCs/>
+          <w:sz w:val="18"/>
+          <w:szCs w:val="18"/>
+        </w:rPr>
+        <w:t xml:space="preserve">Mitteilungen des Instituts für Orientforschung</w:t>
+      </w:r>
+      <w:r>
+        <w:rPr>
+          <w:rFonts w:ascii="Book Antiqua" w:cs="Book Antiqua" w:eastAsia="Book Antiqua" w:hAnsi="Book Antiqua"/>
+          <w:i w:val="false"/>
+          <w:iCs w:val="false"/>
+          <w:sz w:val="18"/>
+          <w:szCs w:val="18"/>
+        </w:rPr>
+        <w:t xml:space="preserve"> 10: 189–206.</w:t>
       </w:r>
     </w:p>
     <w:p>
@@ -9011,10 +9074,32 @@
       <w:r>
         <w:rPr>
           <w:rFonts w:ascii="Book Antiqua" w:cs="Book Antiqua" w:eastAsia="Book Antiqua" w:hAnsi="Book Antiqua"/>
+          <w:i w:val="false"/>
+          <w:iCs w:val="false"/>
           <w:sz w:val="18"/>
           <w:szCs w:val="18"/>
         </w:rPr>
-        <w:t xml:space="preserve">Bauval, Robert. 1989. “A Master-Plan for the Three Pyramids of Giza Based on the Configuration of the Three Stars of the Belt of Orion.” Discussions in Egyptology 13: 7–18.</w:t>
+        <w:t xml:space="preserve">Bauval, Robert. 1989. “A Master-Plan for the Three Pyramids of Giza Based on the Configuration of the Three Stars of the Belt of Orion.” </w:t>
+      </w:r>
+      <w:r>
+        <w:rPr>
+          <w:rFonts w:ascii="Book Antiqua" w:cs="Book Antiqua" w:eastAsia="Book Antiqua" w:hAnsi="Book Antiqua"/>
+          <w:i/>
+          <w:iCs/>
+          <w:sz w:val="18"/>
+          <w:szCs w:val="18"/>
+        </w:rPr>
+        <w:t xml:space="preserve">Discussions in Egyptology</w:t>
+      </w:r>
+      <w:r>
+        <w:rPr>
+          <w:rFonts w:ascii="Book Antiqua" w:cs="Book Antiqua" w:eastAsia="Book Antiqua" w:hAnsi="Book Antiqua"/>
+          <w:i w:val="false"/>
+          <w:iCs w:val="false"/>
+          <w:sz w:val="18"/>
+          <w:szCs w:val="18"/>
+        </w:rPr>
+        <w:t xml:space="preserve"> 13: 7–18.</w:t>
       </w:r>
     </w:p>
     <w:p>
@@ -9025,10 +9110,32 @@
       <w:r>
         <w:rPr>
           <w:rFonts w:ascii="Book Antiqua" w:cs="Book Antiqua" w:eastAsia="Book Antiqua" w:hAnsi="Book Antiqua"/>
+          <w:i w:val="false"/>
+          <w:iCs w:val="false"/>
           <w:sz w:val="18"/>
           <w:szCs w:val="18"/>
         </w:rPr>
-        <w:t xml:space="preserve">Bauval, Robert, and Adrian Gilbert. 1994. The Orion Mystery. London: Heinemann.</w:t>
+        <w:t xml:space="preserve">Bauval, Robert, and Adrian Gilbert. 1994. </w:t>
+      </w:r>
+      <w:r>
+        <w:rPr>
+          <w:rFonts w:ascii="Book Antiqua" w:cs="Book Antiqua" w:eastAsia="Book Antiqua" w:hAnsi="Book Antiqua"/>
+          <w:i/>
+          <w:iCs/>
+          <w:sz w:val="18"/>
+          <w:szCs w:val="18"/>
+        </w:rPr>
+        <w:t xml:space="preserve">The Orion Mystery.</w:t>
+      </w:r>
+      <w:r>
+        <w:rPr>
+          <w:rFonts w:ascii="Book Antiqua" w:cs="Book Antiqua" w:eastAsia="Book Antiqua" w:hAnsi="Book Antiqua"/>
+          <w:i w:val="false"/>
+          <w:iCs w:val="false"/>
+          <w:sz w:val="18"/>
+          <w:szCs w:val="18"/>
+        </w:rPr>
+        <w:t xml:space="preserve"> London: Heinemann.</w:t>
       </w:r>
     </w:p>
     <w:p>
@@ -9039,10 +9146,32 @@
       <w:r>
         <w:rPr>
           <w:rFonts w:ascii="Book Antiqua" w:cs="Book Antiqua" w:eastAsia="Book Antiqua" w:hAnsi="Book Antiqua"/>
+          <w:i w:val="false"/>
+          <w:iCs w:val="false"/>
           <w:sz w:val="18"/>
           <w:szCs w:val="18"/>
         </w:rPr>
-        <w:t xml:space="preserve">Bauval, Robert, and Graham Hancock. 1996. The Message of the Sphinx. New York: Crown.</w:t>
+        <w:t xml:space="preserve">Bauval, Robert, and Graham Hancock. 1996. </w:t>
+      </w:r>
+      <w:r>
+        <w:rPr>
+          <w:rFonts w:ascii="Book Antiqua" w:cs="Book Antiqua" w:eastAsia="Book Antiqua" w:hAnsi="Book Antiqua"/>
+          <w:i/>
+          <w:iCs/>
+          <w:sz w:val="18"/>
+          <w:szCs w:val="18"/>
+        </w:rPr>
+        <w:t xml:space="preserve">The Message of the Sphinx.</w:t>
+      </w:r>
+      <w:r>
+        <w:rPr>
+          <w:rFonts w:ascii="Book Antiqua" w:cs="Book Antiqua" w:eastAsia="Book Antiqua" w:hAnsi="Book Antiqua"/>
+          <w:i w:val="false"/>
+          <w:iCs w:val="false"/>
+          <w:sz w:val="18"/>
+          <w:szCs w:val="18"/>
+        </w:rPr>
+        <w:t xml:space="preserve"> New York: Crown.</w:t>
       </w:r>
     </w:p>
     <w:p>
@@ -9053,10 +9182,32 @@
       <w:r>
         <w:rPr>
           <w:rFonts w:ascii="Book Antiqua" w:cs="Book Antiqua" w:eastAsia="Book Antiqua" w:hAnsi="Book Antiqua"/>
+          <w:i w:val="false"/>
+          <w:iCs w:val="false"/>
           <w:sz w:val="18"/>
           <w:szCs w:val="18"/>
         </w:rPr>
-        <w:t xml:space="preserve">Belmonte, Juan Antonio. 2001. “On the Orientation of Old Kingdom Egyptian Pyramids.” Archaeoastronomy 26: S1–S20.</w:t>
+        <w:t xml:space="preserve">Belmonte, Juan Antonio. 2001. “On the Orientation of Old Kingdom Egyptian Pyramids.” </w:t>
+      </w:r>
+      <w:r>
+        <w:rPr>
+          <w:rFonts w:ascii="Book Antiqua" w:cs="Book Antiqua" w:eastAsia="Book Antiqua" w:hAnsi="Book Antiqua"/>
+          <w:i/>
+          <w:iCs/>
+          <w:sz w:val="18"/>
+          <w:szCs w:val="18"/>
+        </w:rPr>
+        <w:t xml:space="preserve">Archaeoastronomy</w:t>
+      </w:r>
+      <w:r>
+        <w:rPr>
+          <w:rFonts w:ascii="Book Antiqua" w:cs="Book Antiqua" w:eastAsia="Book Antiqua" w:hAnsi="Book Antiqua"/>
+          <w:i w:val="false"/>
+          <w:iCs w:val="false"/>
+          <w:sz w:val="18"/>
+          <w:szCs w:val="18"/>
+        </w:rPr>
+        <w:t xml:space="preserve"> 26: S1–S20.</w:t>
       </w:r>
     </w:p>
     <w:p>
@@ -9067,10 +9218,32 @@
       <w:r>
         <w:rPr>
           <w:rFonts w:ascii="Book Antiqua" w:cs="Book Antiqua" w:eastAsia="Book Antiqua" w:hAnsi="Book Antiqua"/>
+          <w:i w:val="false"/>
+          <w:iCs w:val="false"/>
           <w:sz w:val="18"/>
           <w:szCs w:val="18"/>
         </w:rPr>
-        <w:t xml:space="preserve">Fairall, Anthony. 1999. “Precession and the Layout of the Ancient Egyptian Pyramids.” Astronomy and Geophysics 40 (3): 3.4.</w:t>
+        <w:t xml:space="preserve">Fairall, Anthony. 1999. “Precession and the Layout of the Ancient Egyptian Pyramids.” </w:t>
+      </w:r>
+      <w:r>
+        <w:rPr>
+          <w:rFonts w:ascii="Book Antiqua" w:cs="Book Antiqua" w:eastAsia="Book Antiqua" w:hAnsi="Book Antiqua"/>
+          <w:i/>
+          <w:iCs/>
+          <w:sz w:val="18"/>
+          <w:szCs w:val="18"/>
+        </w:rPr>
+        <w:t xml:space="preserve">Astronomy and Geophysics</w:t>
+      </w:r>
+      <w:r>
+        <w:rPr>
+          <w:rFonts w:ascii="Book Antiqua" w:cs="Book Antiqua" w:eastAsia="Book Antiqua" w:hAnsi="Book Antiqua"/>
+          <w:i w:val="false"/>
+          <w:iCs w:val="false"/>
+          <w:sz w:val="18"/>
+          <w:szCs w:val="18"/>
+        </w:rPr>
+        <w:t xml:space="preserve"> 40 (3): 3.4.</w:t>
       </w:r>
     </w:p>
     <w:p>
@@ -9081,10 +9254,32 @@
       <w:r>
         <w:rPr>
           <w:rFonts w:ascii="Book Antiqua" w:cs="Book Antiqua" w:eastAsia="Book Antiqua" w:hAnsi="Book Antiqua"/>
+          <w:i w:val="false"/>
+          <w:iCs w:val="false"/>
           <w:sz w:val="18"/>
           <w:szCs w:val="18"/>
         </w:rPr>
-        <w:t xml:space="preserve">Gaia Collaboration. 2023. “Gaia Data Release 3: Summary of the Content and Survey Properties.” Astronomy &amp; Astrophysics 674: A1.</w:t>
+        <w:t xml:space="preserve">Gaia Collaboration. 2023. “Gaia Data Release 3: Summary of the Content and Survey Properties.” </w:t>
+      </w:r>
+      <w:r>
+        <w:rPr>
+          <w:rFonts w:ascii="Book Antiqua" w:cs="Book Antiqua" w:eastAsia="Book Antiqua" w:hAnsi="Book Antiqua"/>
+          <w:i/>
+          <w:iCs/>
+          <w:sz w:val="18"/>
+          <w:szCs w:val="18"/>
+        </w:rPr>
+        <w:t xml:space="preserve">Astronomy &amp; Astrophysics</w:t>
+      </w:r>
+      <w:r>
+        <w:rPr>
+          <w:rFonts w:ascii="Book Antiqua" w:cs="Book Antiqua" w:eastAsia="Book Antiqua" w:hAnsi="Book Antiqua"/>
+          <w:i w:val="false"/>
+          <w:iCs w:val="false"/>
+          <w:sz w:val="18"/>
+          <w:szCs w:val="18"/>
+        </w:rPr>
+        <w:t xml:space="preserve"> 674: A1.</w:t>
       </w:r>
     </w:p>
     <w:p>
@@ -9095,10 +9290,32 @@
       <w:r>
         <w:rPr>
           <w:rFonts w:ascii="Book Antiqua" w:cs="Book Antiqua" w:eastAsia="Book Antiqua" w:hAnsi="Book Antiqua"/>
+          <w:i w:val="false"/>
+          <w:iCs w:val="false"/>
           <w:sz w:val="18"/>
           <w:szCs w:val="18"/>
         </w:rPr>
-        <w:t xml:space="preserve">Harding, Jan. 2013. Cult, Religion, and Pilgrimage: Archaeological Investigations at the Neolithic and Bronze Age Monument Complex of Thornborough, North Yorkshire. CBA Research Report 174. York: Council for British Archaeology.</w:t>
+        <w:t xml:space="preserve">Harding, Jan. 2013. </w:t>
+      </w:r>
+      <w:r>
+        <w:rPr>
+          <w:rFonts w:ascii="Book Antiqua" w:cs="Book Antiqua" w:eastAsia="Book Antiqua" w:hAnsi="Book Antiqua"/>
+          <w:i/>
+          <w:iCs/>
+          <w:sz w:val="18"/>
+          <w:szCs w:val="18"/>
+        </w:rPr>
+        <w:t xml:space="preserve">Cult, Religion, and Pilgrimage: Archaeological Investigations at the Neolithic and Bronze Age Monument Complex of Thornborough, North Yorkshire.</w:t>
+      </w:r>
+      <w:r>
+        <w:rPr>
+          <w:rFonts w:ascii="Book Antiqua" w:cs="Book Antiqua" w:eastAsia="Book Antiqua" w:hAnsi="Book Antiqua"/>
+          <w:i w:val="false"/>
+          <w:iCs w:val="false"/>
+          <w:sz w:val="18"/>
+          <w:szCs w:val="18"/>
+        </w:rPr>
+        <w:t xml:space="preserve"> CBA Research Report 174. York: Council for British Archaeology.</w:t>
       </w:r>
     </w:p>
     <w:p>
@@ -9109,10 +9326,32 @@
       <w:r>
         <w:rPr>
           <w:rFonts w:ascii="Book Antiqua" w:cs="Book Antiqua" w:eastAsia="Book Antiqua" w:hAnsi="Book Antiqua"/>
+          <w:i w:val="false"/>
+          <w:iCs w:val="false"/>
           <w:sz w:val="18"/>
           <w:szCs w:val="18"/>
         </w:rPr>
-        <w:t xml:space="preserve">Hoffleit, Dorrit, and Carlos Jaschek. 1991. The Bright Star Catalogue. 5th rev. ed. New Haven: Yale University Observatory.</w:t>
+        <w:t xml:space="preserve">Hoffleit, Dorrit, and Carlos Jaschek. 1991. </w:t>
+      </w:r>
+      <w:r>
+        <w:rPr>
+          <w:rFonts w:ascii="Book Antiqua" w:cs="Book Antiqua" w:eastAsia="Book Antiqua" w:hAnsi="Book Antiqua"/>
+          <w:i/>
+          <w:iCs/>
+          <w:sz w:val="18"/>
+          <w:szCs w:val="18"/>
+        </w:rPr>
+        <w:t xml:space="preserve">The Bright Star Catalogue.</w:t>
+      </w:r>
+      <w:r>
+        <w:rPr>
+          <w:rFonts w:ascii="Book Antiqua" w:cs="Book Antiqua" w:eastAsia="Book Antiqua" w:hAnsi="Book Antiqua"/>
+          <w:i w:val="false"/>
+          <w:iCs w:val="false"/>
+          <w:sz w:val="18"/>
+          <w:szCs w:val="18"/>
+        </w:rPr>
+        <w:t xml:space="preserve"> 5th rev. ed. New Haven: Yale University Observatory.</w:t>
       </w:r>
     </w:p>
     <w:p>
@@ -9123,10 +9362,32 @@
       <w:r>
         <w:rPr>
           <w:rFonts w:ascii="Book Antiqua" w:cs="Book Antiqua" w:eastAsia="Book Antiqua" w:hAnsi="Book Antiqua"/>
+          <w:i w:val="false"/>
+          <w:iCs w:val="false"/>
           <w:sz w:val="18"/>
           <w:szCs w:val="18"/>
         </w:rPr>
-        <w:t xml:space="preserve">Krupp, Edwin C. 1997. “Pyramid Marketing Schemes.” Sky &amp; Telescope 93 (2): 64.</w:t>
+        <w:t xml:space="preserve">Krupp, Edwin C. 1997. “Pyramid Marketing Schemes.” </w:t>
+      </w:r>
+      <w:r>
+        <w:rPr>
+          <w:rFonts w:ascii="Book Antiqua" w:cs="Book Antiqua" w:eastAsia="Book Antiqua" w:hAnsi="Book Antiqua"/>
+          <w:i/>
+          <w:iCs/>
+          <w:sz w:val="18"/>
+          <w:szCs w:val="18"/>
+        </w:rPr>
+        <w:t xml:space="preserve">Sky &amp; Telescope</w:t>
+      </w:r>
+      <w:r>
+        <w:rPr>
+          <w:rFonts w:ascii="Book Antiqua" w:cs="Book Antiqua" w:eastAsia="Book Antiqua" w:hAnsi="Book Antiqua"/>
+          <w:i w:val="false"/>
+          <w:iCs w:val="false"/>
+          <w:sz w:val="18"/>
+          <w:szCs w:val="18"/>
+        </w:rPr>
+        <w:t xml:space="preserve"> 93 (2): 64.</w:t>
       </w:r>
     </w:p>
     <w:p>
@@ -9137,10 +9398,32 @@
       <w:r>
         <w:rPr>
           <w:rFonts w:ascii="Book Antiqua" w:cs="Book Antiqua" w:eastAsia="Book Antiqua" w:hAnsi="Book Antiqua"/>
+          <w:i w:val="false"/>
+          <w:iCs w:val="false"/>
           <w:sz w:val="18"/>
           <w:szCs w:val="18"/>
         </w:rPr>
-        <w:t xml:space="preserve">Legon, John A. R. 1995. “The Orion Correlation and Air-Shaft Theories.” Discussions in Egyptology 33: 45–56.</w:t>
+        <w:t xml:space="preserve">Legon, John A. R. 1995. “The Orion Correlation and Air-Shaft Theories.” </w:t>
+      </w:r>
+      <w:r>
+        <w:rPr>
+          <w:rFonts w:ascii="Book Antiqua" w:cs="Book Antiqua" w:eastAsia="Book Antiqua" w:hAnsi="Book Antiqua"/>
+          <w:i/>
+          <w:iCs/>
+          <w:sz w:val="18"/>
+          <w:szCs w:val="18"/>
+        </w:rPr>
+        <w:t xml:space="preserve">Discussions in Egyptology</w:t>
+      </w:r>
+      <w:r>
+        <w:rPr>
+          <w:rFonts w:ascii="Book Antiqua" w:cs="Book Antiqua" w:eastAsia="Book Antiqua" w:hAnsi="Book Antiqua"/>
+          <w:i w:val="false"/>
+          <w:iCs w:val="false"/>
+          <w:sz w:val="18"/>
+          <w:szCs w:val="18"/>
+        </w:rPr>
+        <w:t xml:space="preserve"> 33: 45–56.</w:t>
       </w:r>
     </w:p>
     <w:p>
@@ -9151,6 +9434,8 @@
       <w:r>
         <w:rPr>
           <w:rFonts w:ascii="Book Antiqua" w:cs="Book Antiqua" w:eastAsia="Book Antiqua" w:hAnsi="Book Antiqua"/>
+          <w:i w:val="false"/>
+          <w:iCs w:val="false"/>
           <w:sz w:val="18"/>
           <w:szCs w:val="18"/>
         </w:rPr>
@@ -9165,10 +9450,32 @@
       <w:r>
         <w:rPr>
           <w:rFonts w:ascii="Book Antiqua" w:cs="Book Antiqua" w:eastAsia="Book Antiqua" w:hAnsi="Book Antiqua"/>
+          <w:i w:val="false"/>
+          <w:iCs w:val="false"/>
           <w:sz w:val="18"/>
           <w:szCs w:val="18"/>
         </w:rPr>
-        <w:t xml:space="preserve">Orofino, Vincenzo, and Paolo Bernardini. 2016. “Archaeoastronomical Study of the Main Pyramids of Giza, Egypt: Possible Correlations with the Stars?” Archaeological Discovery 4: 1–10.</w:t>
+        <w:t xml:space="preserve">Orofino, Vincenzo, and Paolo Bernardini. 2016. “Archaeoastronomical Study of the Main Pyramids of Giza, Egypt: Possible Correlations with the Stars?” </w:t>
+      </w:r>
+      <w:r>
+        <w:rPr>
+          <w:rFonts w:ascii="Book Antiqua" w:cs="Book Antiqua" w:eastAsia="Book Antiqua" w:hAnsi="Book Antiqua"/>
+          <w:i/>
+          <w:iCs/>
+          <w:sz w:val="18"/>
+          <w:szCs w:val="18"/>
+        </w:rPr>
+        <w:t xml:space="preserve">Archaeological Discovery</w:t>
+      </w:r>
+      <w:r>
+        <w:rPr>
+          <w:rFonts w:ascii="Book Antiqua" w:cs="Book Antiqua" w:eastAsia="Book Antiqua" w:hAnsi="Book Antiqua"/>
+          <w:i w:val="false"/>
+          <w:iCs w:val="false"/>
+          <w:sz w:val="18"/>
+          <w:szCs w:val="18"/>
+        </w:rPr>
+        <w:t xml:space="preserve"> 4: 1–10.</w:t>
       </w:r>
     </w:p>
     <w:p>
@@ -9179,10 +9486,32 @@
       <w:r>
         <w:rPr>
           <w:rFonts w:ascii="Book Antiqua" w:cs="Book Antiqua" w:eastAsia="Book Antiqua" w:hAnsi="Book Antiqua"/>
+          <w:i w:val="false"/>
+          <w:iCs w:val="false"/>
           <w:sz w:val="18"/>
           <w:szCs w:val="18"/>
         </w:rPr>
-        <w:t xml:space="preserve">Petrie, W. M. Flinders. 1883. The Pyramids and Temples of Gizeh. London: Field and Tuer.</w:t>
+        <w:t xml:space="preserve">Petrie, W. M. Flinders. 1883. </w:t>
+      </w:r>
+      <w:r>
+        <w:rPr>
+          <w:rFonts w:ascii="Book Antiqua" w:cs="Book Antiqua" w:eastAsia="Book Antiqua" w:hAnsi="Book Antiqua"/>
+          <w:i/>
+          <w:iCs/>
+          <w:sz w:val="18"/>
+          <w:szCs w:val="18"/>
+        </w:rPr>
+        <w:t xml:space="preserve">The Pyramids and Temples of Gizeh.</w:t>
+      </w:r>
+      <w:r>
+        <w:rPr>
+          <w:rFonts w:ascii="Book Antiqua" w:cs="Book Antiqua" w:eastAsia="Book Antiqua" w:hAnsi="Book Antiqua"/>
+          <w:i w:val="false"/>
+          <w:iCs w:val="false"/>
+          <w:sz w:val="18"/>
+          <w:szCs w:val="18"/>
+        </w:rPr>
+        <w:t xml:space="preserve"> London: Field and Tuer.</w:t>
       </w:r>
     </w:p>
     <w:p>
@@ -9193,10 +9522,32 @@
       <w:r>
         <w:rPr>
           <w:rFonts w:ascii="Book Antiqua" w:cs="Book Antiqua" w:eastAsia="Book Antiqua" w:hAnsi="Book Antiqua"/>
+          <w:i w:val="false"/>
+          <w:iCs w:val="false"/>
           <w:sz w:val="18"/>
           <w:szCs w:val="18"/>
         </w:rPr>
-        <w:t xml:space="preserve">Schaefer, Bradley E. 1993. “Astronomy and the Limits of Vision.” Vistas in Astronomy 36: 311–361.</w:t>
+        <w:t xml:space="preserve">Schaefer, Bradley E. 1993. “Astronomy and the Limits of Vision.” </w:t>
+      </w:r>
+      <w:r>
+        <w:rPr>
+          <w:rFonts w:ascii="Book Antiqua" w:cs="Book Antiqua" w:eastAsia="Book Antiqua" w:hAnsi="Book Antiqua"/>
+          <w:i/>
+          <w:iCs/>
+          <w:sz w:val="18"/>
+          <w:szCs w:val="18"/>
+        </w:rPr>
+        <w:t xml:space="preserve">Vistas in Astronomy</w:t>
+      </w:r>
+      <w:r>
+        <w:rPr>
+          <w:rFonts w:ascii="Book Antiqua" w:cs="Book Antiqua" w:eastAsia="Book Antiqua" w:hAnsi="Book Antiqua"/>
+          <w:i w:val="false"/>
+          <w:iCs w:val="false"/>
+          <w:sz w:val="18"/>
+          <w:szCs w:val="18"/>
+        </w:rPr>
+        <w:t xml:space="preserve"> 36: 311–361.</w:t>
       </w:r>
     </w:p>
     <w:p>
@@ -9207,10 +9558,32 @@
       <w:r>
         <w:rPr>
           <w:rFonts w:ascii="Book Antiqua" w:cs="Book Antiqua" w:eastAsia="Book Antiqua" w:hAnsi="Book Antiqua"/>
+          <w:i w:val="false"/>
+          <w:iCs w:val="false"/>
           <w:sz w:val="18"/>
           <w:szCs w:val="18"/>
         </w:rPr>
-        <w:t xml:space="preserve">Spence, Kate. 2000. “Ancient Egyptian Chronology and the Astronomical Orientation of Pyramids.” Nature 408: 320–324.</w:t>
+        <w:t xml:space="preserve">Spence, Kate. 2000. “Ancient Egyptian Chronology and the Astronomical Orientation of Pyramids.” </w:t>
+      </w:r>
+      <w:r>
+        <w:rPr>
+          <w:rFonts w:ascii="Book Antiqua" w:cs="Book Antiqua" w:eastAsia="Book Antiqua" w:hAnsi="Book Antiqua"/>
+          <w:i/>
+          <w:iCs/>
+          <w:sz w:val="18"/>
+          <w:szCs w:val="18"/>
+        </w:rPr>
+        <w:t xml:space="preserve">Nature</w:t>
+      </w:r>
+      <w:r>
+        <w:rPr>
+          <w:rFonts w:ascii="Book Antiqua" w:cs="Book Antiqua" w:eastAsia="Book Antiqua" w:hAnsi="Book Antiqua"/>
+          <w:i w:val="false"/>
+          <w:iCs w:val="false"/>
+          <w:sz w:val="18"/>
+          <w:szCs w:val="18"/>
+        </w:rPr>
+        <w:t xml:space="preserve"> 408: 320–324.</w:t>
       </w:r>
     </w:p>
     <w:p>
@@ -9221,10 +9594,32 @@
       <w:r>
         <w:rPr>
           <w:rFonts w:ascii="Book Antiqua" w:cs="Book Antiqua" w:eastAsia="Book Antiqua" w:hAnsi="Book Antiqua"/>
+          <w:i w:val="false"/>
+          <w:iCs w:val="false"/>
           <w:sz w:val="18"/>
           <w:szCs w:val="18"/>
         </w:rPr>
-        <w:t xml:space="preserve">Trimble, Virginia. 1964. “Astronomical Investigation Concerning the So-Called Air-Shafts of Cheops’ Pyramid.” Mitteilungen des Instituts für Orientforschung 10: 183–187.</w:t>
+        <w:t xml:space="preserve">Trimble, Virginia. 1964. “Astronomical Investigation Concerning the So-Called Air-Shafts of Cheops’ Pyramid.” </w:t>
+      </w:r>
+      <w:r>
+        <w:rPr>
+          <w:rFonts w:ascii="Book Antiqua" w:cs="Book Antiqua" w:eastAsia="Book Antiqua" w:hAnsi="Book Antiqua"/>
+          <w:i/>
+          <w:iCs/>
+          <w:sz w:val="18"/>
+          <w:szCs w:val="18"/>
+        </w:rPr>
+        <w:t xml:space="preserve">Mitteilungen des Instituts für Orientforschung</w:t>
+      </w:r>
+      <w:r>
+        <w:rPr>
+          <w:rFonts w:ascii="Book Antiqua" w:cs="Book Antiqua" w:eastAsia="Book Antiqua" w:hAnsi="Book Antiqua"/>
+          <w:i w:val="false"/>
+          <w:iCs w:val="false"/>
+          <w:sz w:val="18"/>
+          <w:szCs w:val="18"/>
+        </w:rPr>
+        <w:t xml:space="preserve"> 10: 183–187.</w:t>
       </w:r>
     </w:p>
     <w:p>
@@ -9235,10 +9630,32 @@
       <w:r>
         <w:rPr>
           <w:rFonts w:ascii="Book Antiqua" w:cs="Book Antiqua" w:eastAsia="Book Antiqua" w:hAnsi="Book Antiqua"/>
+          <w:i w:val="false"/>
+          <w:iCs w:val="false"/>
           <w:sz w:val="18"/>
           <w:szCs w:val="18"/>
         </w:rPr>
-        <w:t xml:space="preserve">Vecchiato, Alberto, Gabriella Bernardi, and Alberto Cora. 2025. “Point-Pattern Matching and Probability in Archaeoastronomy.” Journal of Astronomical History and Heritage 28 (1): 13.</w:t>
+        <w:t xml:space="preserve">Vecchiato, Alberto, Gabriella Bernardi, and Alberto Cora. 2025. “Point-Pattern Matching and Probability in Archaeoastronomy.” </w:t>
+      </w:r>
+      <w:r>
+        <w:rPr>
+          <w:rFonts w:ascii="Book Antiqua" w:cs="Book Antiqua" w:eastAsia="Book Antiqua" w:hAnsi="Book Antiqua"/>
+          <w:i/>
+          <w:iCs/>
+          <w:sz w:val="18"/>
+          <w:szCs w:val="18"/>
+        </w:rPr>
+        <w:t xml:space="preserve">Journal of Astronomical History and Heritage</w:t>
+      </w:r>
+      <w:r>
+        <w:rPr>
+          <w:rFonts w:ascii="Book Antiqua" w:cs="Book Antiqua" w:eastAsia="Book Antiqua" w:hAnsi="Book Antiqua"/>
+          <w:i w:val="false"/>
+          <w:iCs w:val="false"/>
+          <w:sz w:val="18"/>
+          <w:szCs w:val="18"/>
+        </w:rPr>
+        <w:t xml:space="preserve"> 28 (1): 13.</w:t>
       </w:r>
     </w:p>
     <w:sectPr>

</xml_diff>